<commit_message>
Adicionando GMUD e atualização de documentação
</commit_message>
<xml_diff>
--- a/Disciplinas/TI/FlowIT.docx
+++ b/Disciplinas/TI/FlowIT.docx
@@ -1,6 +1,6 @@
 
 <file path=word/document.xml><?xml version="1.0" encoding="utf-8"?>
-<w:document xmlns:wpc="http://schemas.microsoft.com/office/word/2010/wordprocessingCanvas" xmlns:cx="http://schemas.microsoft.com/office/drawing/2014/chartex" xmlns:cx1="http://schemas.microsoft.com/office/drawing/2015/9/8/chartex" xmlns:cx2="http://schemas.microsoft.com/office/drawing/2015/10/21/chartex" xmlns:cx3="http://schemas.microsoft.com/office/drawing/2016/5/9/chartex" xmlns:cx4="http://schemas.microsoft.com/office/drawing/2016/5/10/chartex" xmlns:cx5="http://schemas.microsoft.com/office/drawing/2016/5/11/chartex" xmlns:cx6="http://schemas.microsoft.com/office/drawing/2016/5/12/chartex" xmlns:cx7="http://schemas.microsoft.com/office/drawing/2016/5/13/chartex" xmlns:cx8="http://schemas.microsoft.com/office/drawing/2016/5/14/chartex" xmlns:mc="http://schemas.openxmlformats.org/markup-compatibility/2006" xmlns:aink="http://schemas.microsoft.com/office/drawing/2016/ink" xmlns:am3d="http://schemas.microsoft.com/office/drawing/2017/model3d" xmlns:o="urn:schemas-microsoft-com:office:office" xmlns:oel="http://schemas.microsoft.com/office/2019/extlst" xmlns:r="http://schemas.openxmlformats.org/officeDocument/2006/relationships" xmlns:m="http://schemas.openxmlformats.org/officeDocument/2006/math" xmlns:v="urn:schemas-microsoft-com:vml" xmlns:wp14="http://schemas.microsoft.com/office/word/2010/wordprocessingDrawing" xmlns:wp="http://schemas.openxmlformats.org/drawingml/2006/wordprocessingDrawing" xmlns:w10="urn:schemas-microsoft-com:office:word" xmlns:w="http://schemas.openxmlformats.org/wordprocessingml/2006/main" xmlns:w14="http://schemas.microsoft.com/office/word/2010/wordml" xmlns:w15="http://schemas.microsoft.com/office/word/2012/wordml" xmlns:w16cex="http://schemas.microsoft.com/office/word/2018/wordml/cex" xmlns:w16cid="http://schemas.microsoft.com/office/word/2016/wordml/cid" xmlns:w16="http://schemas.microsoft.com/office/word/2018/wordml" xmlns:w16du="http://schemas.microsoft.com/office/word/2023/wordml/word16du" xmlns:w16sdtdh="http://schemas.microsoft.com/office/word/2020/wordml/sdtdatahash" xmlns:w16sdtfl="http://schemas.microsoft.com/office/word/2024/wordml/sdtformatlock" xmlns:w16se="http://schemas.microsoft.com/office/word/2015/wordml/symex" xmlns:wpg="http://schemas.microsoft.com/office/word/2010/wordprocessingGroup" xmlns:wpi="http://schemas.microsoft.com/office/word/2010/wordprocessingInk" xmlns:wne="http://schemas.microsoft.com/office/word/2006/wordml" xmlns:wps="http://schemas.microsoft.com/office/word/2010/wordprocessingShape" mc:Ignorable="w14 w15 w16se w16cid w16 w16cex w16sdtdh w16sdtfl w16du wp14">
+<w:document xmlns:wpc="http://schemas.microsoft.com/office/word/2010/wordprocessingCanvas" xmlns:cx="http://schemas.microsoft.com/office/drawing/2014/chartex" xmlns:cx1="http://schemas.microsoft.com/office/drawing/2015/9/8/chartex" xmlns:cx2="http://schemas.microsoft.com/office/drawing/2015/10/21/chartex" xmlns:cx3="http://schemas.microsoft.com/office/drawing/2016/5/9/chartex" xmlns:cx4="http://schemas.microsoft.com/office/drawing/2016/5/10/chartex" xmlns:cx5="http://schemas.microsoft.com/office/drawing/2016/5/11/chartex" xmlns:cx6="http://schemas.microsoft.com/office/drawing/2016/5/12/chartex" xmlns:cx7="http://schemas.microsoft.com/office/drawing/2016/5/13/chartex" xmlns:cx8="http://schemas.microsoft.com/office/drawing/2016/5/14/chartex" xmlns:mc="http://schemas.openxmlformats.org/markup-compatibility/2006" xmlns:aink="http://schemas.microsoft.com/office/drawing/2016/ink" xmlns:am3d="http://schemas.microsoft.com/office/drawing/2017/model3d" xmlns:o="urn:schemas-microsoft-com:office:office" xmlns:oel="http://schemas.microsoft.com/office/2019/extlst" xmlns:r="http://schemas.openxmlformats.org/officeDocument/2006/relationships" xmlns:m="http://schemas.openxmlformats.org/officeDocument/2006/math" xmlns:v="urn:schemas-microsoft-com:vml" xmlns:wp14="http://schemas.microsoft.com/office/word/2010/wordprocessingDrawing" xmlns:wp="http://schemas.openxmlformats.org/drawingml/2006/wordprocessingDrawing" xmlns:w10="urn:schemas-microsoft-com:office:word" xmlns:w="http://schemas.openxmlformats.org/wordprocessingml/2006/main" xmlns:w14="http://schemas.microsoft.com/office/word/2010/wordml" xmlns:w15="http://schemas.microsoft.com/office/word/2012/wordml" xmlns:w16cex="http://schemas.microsoft.com/office/word/2018/wordml/cex" xmlns:w16cid="http://schemas.microsoft.com/office/word/2016/wordml/cid" xmlns:w16="http://schemas.microsoft.com/office/word/2018/wordml" xmlns:w16sdtdh="http://schemas.microsoft.com/office/word/2020/wordml/sdtdatahash" xmlns:w16se="http://schemas.microsoft.com/office/word/2015/wordml/symex" xmlns:wpg="http://schemas.microsoft.com/office/word/2010/wordprocessingGroup" xmlns:wpi="http://schemas.microsoft.com/office/word/2010/wordprocessingInk" xmlns:wne="http://schemas.microsoft.com/office/word/2006/wordml" xmlns:wps="http://schemas.microsoft.com/office/word/2010/wordprocessingShape" mc:Ignorable="w14 w15 w16se w16cid w16 w16cex w16sdtdh wp14">
   <w:body>
     <w:p>
       <w:pPr>
@@ -101,7 +101,10 @@
         <w:jc w:val="center"/>
       </w:pPr>
       <w:r>
-        <w:t xml:space="preserve">Larissa Maria Pires Lopes </w:t>
+        <w:t>Larissa Maria Pires Lope</w:t>
+      </w:r>
+      <w:r>
+        <w:t>z</w:t>
       </w:r>
     </w:p>
     <w:p>
@@ -4877,15 +4880,20 @@
         <w:t>• Dependência da infraestrutura elétrica e de rede disponível no local para funcionamento contínuo dos sensores e envio dos dados.</w:t>
       </w:r>
     </w:p>
-    <w:p/>
     <w:p>
       <w:pPr>
         <w:numPr>
           <w:ilvl w:val="0"/>
           <w:numId w:val="17"/>
         </w:numPr>
+        <w:rPr>
+          <w:rFonts w:ascii="Arial" w:hAnsi="Arial" w:cs="Arial"/>
+        </w:rPr>
       </w:pPr>
       <w:r>
+        <w:rPr>
+          <w:rFonts w:ascii="Arial" w:hAnsi="Arial" w:cs="Arial"/>
+        </w:rPr>
         <w:t xml:space="preserve">O sensor ultrassônico possui alcance e precisão limitados, geralmente entre 2 cm e 400 cm. </w:t>
       </w:r>
     </w:p>
@@ -4895,8 +4903,14 @@
           <w:ilvl w:val="0"/>
           <w:numId w:val="17"/>
         </w:numPr>
+        <w:rPr>
+          <w:rFonts w:ascii="Arial" w:hAnsi="Arial" w:cs="Arial"/>
+        </w:rPr>
       </w:pPr>
       <w:r>
+        <w:rPr>
+          <w:rFonts w:ascii="Arial" w:hAnsi="Arial" w:cs="Arial"/>
+        </w:rPr>
         <w:t xml:space="preserve">O funcionamento depende de posicionamento adequado (altura, ângulo e distância), sendo sensível a erros de instalação. </w:t>
       </w:r>
     </w:p>
@@ -4906,8 +4920,14 @@
           <w:ilvl w:val="0"/>
           <w:numId w:val="17"/>
         </w:numPr>
+        <w:rPr>
+          <w:rFonts w:ascii="Arial" w:hAnsi="Arial" w:cs="Arial"/>
+        </w:rPr>
       </w:pPr>
       <w:r>
+        <w:rPr>
+          <w:rFonts w:ascii="Arial" w:hAnsi="Arial" w:cs="Arial"/>
+        </w:rPr>
         <w:t>O sensor não diferencia tipos de objetos.</w:t>
       </w:r>
     </w:p>
@@ -4917,8 +4937,14 @@
           <w:ilvl w:val="0"/>
           <w:numId w:val="17"/>
         </w:numPr>
+        <w:rPr>
+          <w:rFonts w:ascii="Arial" w:hAnsi="Arial" w:cs="Arial"/>
+        </w:rPr>
       </w:pPr>
       <w:r>
+        <w:rPr>
+          <w:rFonts w:ascii="Arial" w:hAnsi="Arial" w:cs="Arial"/>
+        </w:rPr>
         <w:t xml:space="preserve">A taxa de atualização do sensor limita a detecção em ambientes com fluxo muito intenso. </w:t>
       </w:r>
     </w:p>
@@ -4928,8 +4954,14 @@
           <w:ilvl w:val="0"/>
           <w:numId w:val="17"/>
         </w:numPr>
+        <w:rPr>
+          <w:rFonts w:ascii="Arial" w:hAnsi="Arial" w:cs="Arial"/>
+        </w:rPr>
       </w:pPr>
       <w:r>
+        <w:rPr>
+          <w:rFonts w:ascii="Arial" w:hAnsi="Arial" w:cs="Arial"/>
+        </w:rPr>
         <w:t xml:space="preserve">A instalação deve respeitar a estrutura da loja, evitando mudanças físicas significativas. </w:t>
       </w:r>
     </w:p>
@@ -4939,8 +4971,14 @@
           <w:ilvl w:val="0"/>
           <w:numId w:val="17"/>
         </w:numPr>
+        <w:rPr>
+          <w:rFonts w:ascii="Arial" w:hAnsi="Arial" w:cs="Arial"/>
+        </w:rPr>
       </w:pPr>
       <w:r>
+        <w:rPr>
+          <w:rFonts w:ascii="Arial" w:hAnsi="Arial" w:cs="Arial"/>
+        </w:rPr>
         <w:t xml:space="preserve">O sistema depende de alimentação elétrica contínua e conexão para envio de dados. </w:t>
       </w:r>
     </w:p>
@@ -9996,7 +10034,7 @@
 </file>
 
 <file path=word/numbering.xml><?xml version="1.0" encoding="utf-8"?>
-<w:numbering xmlns:wpc="http://schemas.microsoft.com/office/word/2010/wordprocessingCanvas" xmlns:cx="http://schemas.microsoft.com/office/drawing/2014/chartex" xmlns:cx1="http://schemas.microsoft.com/office/drawing/2015/9/8/chartex" xmlns:cx2="http://schemas.microsoft.com/office/drawing/2015/10/21/chartex" xmlns:cx3="http://schemas.microsoft.com/office/drawing/2016/5/9/chartex" xmlns:cx4="http://schemas.microsoft.com/office/drawing/2016/5/10/chartex" xmlns:cx5="http://schemas.microsoft.com/office/drawing/2016/5/11/chartex" xmlns:cx6="http://schemas.microsoft.com/office/drawing/2016/5/12/chartex" xmlns:cx7="http://schemas.microsoft.com/office/drawing/2016/5/13/chartex" xmlns:cx8="http://schemas.microsoft.com/office/drawing/2016/5/14/chartex" xmlns:mc="http://schemas.openxmlformats.org/markup-compatibility/2006" xmlns:aink="http://schemas.microsoft.com/office/drawing/2016/ink" xmlns:am3d="http://schemas.microsoft.com/office/drawing/2017/model3d" xmlns:o="urn:schemas-microsoft-com:office:office" xmlns:oel="http://schemas.microsoft.com/office/2019/extlst" xmlns:r="http://schemas.openxmlformats.org/officeDocument/2006/relationships" xmlns:m="http://schemas.openxmlformats.org/officeDocument/2006/math" xmlns:v="urn:schemas-microsoft-com:vml" xmlns:wp14="http://schemas.microsoft.com/office/word/2010/wordprocessingDrawing" xmlns:wp="http://schemas.openxmlformats.org/drawingml/2006/wordprocessingDrawing" xmlns:w10="urn:schemas-microsoft-com:office:word" xmlns:w="http://schemas.openxmlformats.org/wordprocessingml/2006/main" xmlns:w14="http://schemas.microsoft.com/office/word/2010/wordml" xmlns:w15="http://schemas.microsoft.com/office/word/2012/wordml" xmlns:w16cex="http://schemas.microsoft.com/office/word/2018/wordml/cex" xmlns:w16cid="http://schemas.microsoft.com/office/word/2016/wordml/cid" xmlns:w16="http://schemas.microsoft.com/office/word/2018/wordml" xmlns:w16du="http://schemas.microsoft.com/office/word/2023/wordml/word16du" xmlns:w16sdtdh="http://schemas.microsoft.com/office/word/2020/wordml/sdtdatahash" xmlns:w16sdtfl="http://schemas.microsoft.com/office/word/2024/wordml/sdtformatlock" xmlns:w16se="http://schemas.microsoft.com/office/word/2015/wordml/symex" xmlns:wpg="http://schemas.microsoft.com/office/word/2010/wordprocessingGroup" xmlns:wpi="http://schemas.microsoft.com/office/word/2010/wordprocessingInk" xmlns:wne="http://schemas.microsoft.com/office/word/2006/wordml" xmlns:wps="http://schemas.microsoft.com/office/word/2010/wordprocessingShape" mc:Ignorable="w14 w15 w16se w16cid w16 w16cex w16sdtdh w16sdtfl w16du wp14">
+<w:numbering xmlns:wpc="http://schemas.microsoft.com/office/word/2010/wordprocessingCanvas" xmlns:cx="http://schemas.microsoft.com/office/drawing/2014/chartex" xmlns:cx1="http://schemas.microsoft.com/office/drawing/2015/9/8/chartex" xmlns:cx2="http://schemas.microsoft.com/office/drawing/2015/10/21/chartex" xmlns:cx3="http://schemas.microsoft.com/office/drawing/2016/5/9/chartex" xmlns:cx4="http://schemas.microsoft.com/office/drawing/2016/5/10/chartex" xmlns:cx5="http://schemas.microsoft.com/office/drawing/2016/5/11/chartex" xmlns:cx6="http://schemas.microsoft.com/office/drawing/2016/5/12/chartex" xmlns:cx7="http://schemas.microsoft.com/office/drawing/2016/5/13/chartex" xmlns:cx8="http://schemas.microsoft.com/office/drawing/2016/5/14/chartex" xmlns:mc="http://schemas.openxmlformats.org/markup-compatibility/2006" xmlns:aink="http://schemas.microsoft.com/office/drawing/2016/ink" xmlns:am3d="http://schemas.microsoft.com/office/drawing/2017/model3d" xmlns:o="urn:schemas-microsoft-com:office:office" xmlns:oel="http://schemas.microsoft.com/office/2019/extlst" xmlns:r="http://schemas.openxmlformats.org/officeDocument/2006/relationships" xmlns:m="http://schemas.openxmlformats.org/officeDocument/2006/math" xmlns:v="urn:schemas-microsoft-com:vml" xmlns:wp14="http://schemas.microsoft.com/office/word/2010/wordprocessingDrawing" xmlns:wp="http://schemas.openxmlformats.org/drawingml/2006/wordprocessingDrawing" xmlns:w10="urn:schemas-microsoft-com:office:word" xmlns:w="http://schemas.openxmlformats.org/wordprocessingml/2006/main" xmlns:w14="http://schemas.microsoft.com/office/word/2010/wordml" xmlns:w15="http://schemas.microsoft.com/office/word/2012/wordml" xmlns:w16cex="http://schemas.microsoft.com/office/word/2018/wordml/cex" xmlns:w16cid="http://schemas.microsoft.com/office/word/2016/wordml/cid" xmlns:w16="http://schemas.microsoft.com/office/word/2018/wordml" xmlns:w16sdtdh="http://schemas.microsoft.com/office/word/2020/wordml/sdtdatahash" xmlns:w16se="http://schemas.microsoft.com/office/word/2015/wordml/symex" xmlns:wpg="http://schemas.microsoft.com/office/word/2010/wordprocessingGroup" xmlns:wpi="http://schemas.microsoft.com/office/word/2010/wordprocessingInk" xmlns:wne="http://schemas.microsoft.com/office/word/2006/wordml" xmlns:wps="http://schemas.microsoft.com/office/word/2010/wordprocessingShape" mc:Ignorable="w14 w15 w16se w16cid w16 w16cex w16sdtdh wp14">
   <w:abstractNum w:abstractNumId="0" w15:restartNumberingAfterBreak="0">
     <w:nsid w:val="09F063C8"/>
     <w:multiLevelType w:val="multilevel"/>
@@ -11044,7 +11082,7 @@
 </file>
 
 <file path=word/styles.xml><?xml version="1.0" encoding="utf-8"?>
-<w:styles xmlns:mc="http://schemas.openxmlformats.org/markup-compatibility/2006" xmlns:r="http://schemas.openxmlformats.org/officeDocument/2006/relationships" xmlns:w="http://schemas.openxmlformats.org/wordprocessingml/2006/main" xmlns:w14="http://schemas.microsoft.com/office/word/2010/wordml" xmlns:w15="http://schemas.microsoft.com/office/word/2012/wordml" xmlns:w16cex="http://schemas.microsoft.com/office/word/2018/wordml/cex" xmlns:w16cid="http://schemas.microsoft.com/office/word/2016/wordml/cid" xmlns:w16="http://schemas.microsoft.com/office/word/2018/wordml" xmlns:w16du="http://schemas.microsoft.com/office/word/2023/wordml/word16du" xmlns:w16sdtdh="http://schemas.microsoft.com/office/word/2020/wordml/sdtdatahash" xmlns:w16sdtfl="http://schemas.microsoft.com/office/word/2024/wordml/sdtformatlock" xmlns:w16se="http://schemas.microsoft.com/office/word/2015/wordml/symex" mc:Ignorable="w14 w15 w16se w16cid w16 w16cex w16sdtdh w16sdtfl w16du">
+<w:styles xmlns:mc="http://schemas.openxmlformats.org/markup-compatibility/2006" xmlns:r="http://schemas.openxmlformats.org/officeDocument/2006/relationships" xmlns:w="http://schemas.openxmlformats.org/wordprocessingml/2006/main" xmlns:w14="http://schemas.microsoft.com/office/word/2010/wordml" xmlns:w15="http://schemas.microsoft.com/office/word/2012/wordml" xmlns:w16cex="http://schemas.microsoft.com/office/word/2018/wordml/cex" xmlns:w16cid="http://schemas.microsoft.com/office/word/2016/wordml/cid" xmlns:w16="http://schemas.microsoft.com/office/word/2018/wordml" xmlns:w16sdtdh="http://schemas.microsoft.com/office/word/2020/wordml/sdtdatahash" xmlns:w16se="http://schemas.microsoft.com/office/word/2015/wordml/symex" mc:Ignorable="w14 w15 w16se w16cid w16 w16cex w16sdtdh">
   <w:docDefaults>
     <w:rPrDefault>
       <w:rPr>

</xml_diff>